<commit_message>
add the checker chapter one pdf to Samples
</commit_message>
<xml_diff>
--- a/readrory idea.docx
+++ b/readrory idea.docx
@@ -1994,6 +1994,14 @@
         </w:rPr>
         <w:t xml:space="preserve"> by reading Sci-Fi</w:t>
       </w:r>
+      <w:r>
+        <w:rPr>
+          <w:rFonts w:cs="Times New Roman"/>
+          <w:sz w:val="28"/>
+          <w:szCs w:val="28"/>
+        </w:rPr>
+        <w:t>.</w:t>
+      </w:r>
     </w:p>
     <w:p>
       <w:pPr>
@@ -2128,6 +2136,175 @@
           <w:szCs w:val="28"/>
         </w:rPr>
       </w:pPr>
+    </w:p>
+    <w:p>
+      <w:pPr>
+        <w:ind w:firstLine="720"/>
+        <w:rPr>
+          <w:rFonts w:cs="Times New Roman"/>
+          <w:sz w:val="28"/>
+          <w:szCs w:val="28"/>
+        </w:rPr>
+      </w:pPr>
+      <w:r>
+        <w:rPr>
+          <w:rFonts w:cs="Times New Roman"/>
+          <w:sz w:val="28"/>
+          <w:szCs w:val="28"/>
+        </w:rPr>
+        <w:t xml:space="preserve">How do you choose something that works </w:t>
+      </w:r>
+      <w:r>
+        <w:rPr>
+          <w:rFonts w:cs="Times New Roman"/>
+          <w:sz w:val="28"/>
+          <w:szCs w:val="28"/>
+        </w:rPr>
+        <w:t>with</w:t>
+      </w:r>
+      <w:r>
+        <w:rPr>
+          <w:rFonts w:cs="Times New Roman"/>
+          <w:sz w:val="28"/>
+          <w:szCs w:val="28"/>
+        </w:rPr>
+        <w:t xml:space="preserve"> all of those elements, which direction?  With questions like these, the answer is knowledge. Be curious, know the world around you, and see the tether between recovery and learning. In this world, people will have to recover. To recover requires adhering to adaptations, and you have to learn this to improve your recovery.</w:t>
+      </w:r>
+    </w:p>
+    <w:p>
+      <w:pPr>
+        <w:ind w:firstLine="720"/>
+        <w:rPr>
+          <w:rFonts w:cs="Times New Roman"/>
+          <w:sz w:val="28"/>
+          <w:szCs w:val="28"/>
+        </w:rPr>
+      </w:pPr>
+      <w:r>
+        <w:rPr>
+          <w:rFonts w:cs="Times New Roman"/>
+          <w:sz w:val="28"/>
+          <w:szCs w:val="28"/>
+        </w:rPr>
+        <w:t>When you have known what it is to recover, and you have the ability, you extend the length to avoid needing another recovery. The work of insight yields this length, a margin that protects your ability to predict, and therefore navigate life’s changes, prevent mishaps, and handle hazards. Knowledge of this would be advantageous to those who have attained it.</w:t>
+      </w:r>
+    </w:p>
+    <w:p>
+      <w:pPr>
+        <w:ind w:firstLine="720"/>
+        <w:rPr>
+          <w:rFonts w:cs="Times New Roman"/>
+          <w:sz w:val="28"/>
+          <w:szCs w:val="28"/>
+        </w:rPr>
+      </w:pPr>
+      <w:r>
+        <w:rPr>
+          <w:rFonts w:cs="Times New Roman"/>
+          <w:sz w:val="28"/>
+          <w:szCs w:val="28"/>
+        </w:rPr>
+        <w:t>Complexity creates ambiguity, those who discern more of the ambiguity see how it can create blindspots and obfuscating assumptions. “Legacy Society” doesn’t exist, it’s just society. Yet, the concept remains. Distinction, predictability, knowledge, intelligence systems, are things you have been already and have always been engaged in. Simply as other people populated the planet before you and left you something to get started with. Their intelligence, their cause and its effect</w:t>
+      </w:r>
+      <w:r>
+        <w:rPr>
+          <w:rFonts w:cs="Times New Roman"/>
+          <w:sz w:val="28"/>
+          <w:szCs w:val="28"/>
+        </w:rPr>
+        <w:t xml:space="preserve"> has already influenced you.</w:t>
+      </w:r>
+    </w:p>
+    <w:p>
+      <w:pPr>
+        <w:ind w:firstLine="720"/>
+        <w:rPr>
+          <w:rFonts w:cs="Times New Roman"/>
+          <w:sz w:val="28"/>
+          <w:szCs w:val="28"/>
+        </w:rPr>
+      </w:pPr>
+      <w:r>
+        <w:rPr>
+          <w:rFonts w:cs="Times New Roman"/>
+          <w:sz w:val="28"/>
+          <w:szCs w:val="28"/>
+        </w:rPr>
+        <w:t>People can cause change, and attempt to cause specific changes, and we can call this innovation. If you know the environment, you should see how innovations intertwine into the extant complexity of our world and the nature of our kind.</w:t>
+      </w:r>
+    </w:p>
+    <w:p>
+      <w:pPr>
+        <w:rPr>
+          <w:rFonts w:cs="Times New Roman"/>
+          <w:sz w:val="28"/>
+          <w:szCs w:val="28"/>
+        </w:rPr>
+      </w:pPr>
+    </w:p>
+    <w:p>
+      <w:pPr>
+        <w:jc w:val="center"/>
+        <w:rPr>
+          <w:rFonts w:cs="Times New Roman"/>
+          <w:sz w:val="28"/>
+          <w:szCs w:val="28"/>
+          <w:u w:val="single"/>
+        </w:rPr>
+      </w:pPr>
+      <w:r>
+        <w:rPr>
+          <w:rFonts w:cs="Times New Roman"/>
+          <w:sz w:val="28"/>
+          <w:szCs w:val="28"/>
+          <w:u w:val="single"/>
+        </w:rPr>
+        <w:t>Informed and Aligned Analysis</w:t>
+      </w:r>
+    </w:p>
+    <w:p>
+      <w:pPr>
+        <w:jc w:val="center"/>
+        <w:rPr>
+          <w:rFonts w:cs="Times New Roman"/>
+          <w:sz w:val="28"/>
+          <w:szCs w:val="28"/>
+        </w:rPr>
+      </w:pPr>
+      <w:r>
+        <w:rPr>
+          <w:rFonts w:cs="Times New Roman"/>
+          <w:sz w:val="28"/>
+          <w:szCs w:val="28"/>
+        </w:rPr>
+        <w:t>- Characterizing ethics in civilization, the traits needed for moral advancements in a tech-evolved world -</w:t>
+      </w:r>
+    </w:p>
+    <w:p>
+      <w:pPr>
+        <w:rPr>
+          <w:rFonts w:cs="Times New Roman"/>
+          <w:sz w:val="28"/>
+          <w:szCs w:val="28"/>
+        </w:rPr>
+      </w:pPr>
+    </w:p>
+    <w:p>
+      <w:pPr>
+        <w:rPr>
+          <w:rFonts w:cs="Times New Roman"/>
+          <w:sz w:val="28"/>
+          <w:szCs w:val="28"/>
+        </w:rPr>
+      </w:pPr>
+      <w:r>
+        <w:rPr>
+          <w:rFonts w:cs="Times New Roman"/>
+          <w:sz w:val="28"/>
+          <w:szCs w:val="28"/>
+        </w:rPr>
+        <w:t xml:space="preserve">Innovations and development, ethics of technology and environment. What do we owe our understanding to, specifically? Stability. Anything we have, anything we </w:t>
+      </w:r>
       <w:r>
         <w:rPr>
           <w:rFonts w:cs="Times New Roman"/>
@@ -2135,209 +2312,7 @@
           <w:szCs w:val="28"/>
         </w:rPr>
         <w:lastRenderedPageBreak/>
-        <w:t>Hope. As Above</w:t>
-      </w:r>
-      <w:r>
-        <w:rPr>
-          <w:rFonts w:cs="Times New Roman"/>
-          <w:sz w:val="28"/>
-          <w:szCs w:val="28"/>
-        </w:rPr>
-        <w:t>,</w:t>
-      </w:r>
-      <w:r>
-        <w:rPr>
-          <w:rFonts w:cs="Times New Roman"/>
-          <w:sz w:val="28"/>
-          <w:szCs w:val="28"/>
-        </w:rPr>
-        <w:t xml:space="preserve"> So Below. Choosing a course that creates mutual benefit is to your benefit. There are options, you have your freedom. What will you choose? Do you choose to learn about technology, and how it is used on top of the current layer of human nature? How do emergent </w:t>
-      </w:r>
-      <w:r>
-        <w:rPr>
-          <w:rFonts w:cs="Times New Roman"/>
-          <w:sz w:val="28"/>
-          <w:szCs w:val="28"/>
-        </w:rPr>
-        <w:t>innovations</w:t>
-      </w:r>
-      <w:r>
-        <w:rPr>
-          <w:rFonts w:cs="Times New Roman"/>
-          <w:sz w:val="28"/>
-          <w:szCs w:val="28"/>
-        </w:rPr>
-        <w:t xml:space="preserve"> reflect power dynamics, what is the structure to society that we gain from science, and what role would you choose in it?</w:t>
-      </w:r>
-    </w:p>
-    <w:p>
-      <w:pPr>
-        <w:ind w:firstLine="720"/>
-        <w:rPr>
-          <w:rFonts w:cs="Times New Roman"/>
-          <w:sz w:val="28"/>
-          <w:szCs w:val="28"/>
-        </w:rPr>
-      </w:pPr>
-      <w:r>
-        <w:rPr>
-          <w:rFonts w:cs="Times New Roman"/>
-          <w:sz w:val="28"/>
-          <w:szCs w:val="28"/>
-        </w:rPr>
-        <w:t xml:space="preserve">How do you choose something that works </w:t>
-      </w:r>
-      <w:r>
-        <w:rPr>
-          <w:rFonts w:cs="Times New Roman"/>
-          <w:sz w:val="28"/>
-          <w:szCs w:val="28"/>
-        </w:rPr>
-        <w:t>with</w:t>
-      </w:r>
-      <w:r>
-        <w:rPr>
-          <w:rFonts w:cs="Times New Roman"/>
-          <w:sz w:val="28"/>
-          <w:szCs w:val="28"/>
-        </w:rPr>
-        <w:t xml:space="preserve"> all of those elements, which direction?  With questions like these, the answer is knowledge. Be curious, know the world around you, and see the tether between recovery and learning. In this world, people will have to recover. To recover requires adhering to adaptations, and you have to learn this to improve your recovery.</w:t>
-      </w:r>
-    </w:p>
-    <w:p>
-      <w:pPr>
-        <w:ind w:firstLine="720"/>
-        <w:rPr>
-          <w:rFonts w:cs="Times New Roman"/>
-          <w:sz w:val="28"/>
-          <w:szCs w:val="28"/>
-        </w:rPr>
-      </w:pPr>
-      <w:r>
-        <w:rPr>
-          <w:rFonts w:cs="Times New Roman"/>
-          <w:sz w:val="28"/>
-          <w:szCs w:val="28"/>
-        </w:rPr>
-        <w:t>When you have known what it is to recover, and you have the ability, you extend the length to avoid needing another recovery. The work of insight yields this length, a margin that protects your ability to predict, and therefore navigate life’s changes, prevent mishaps, and handle hazards. Knowledge of this would be advantageous to those who have attained it.</w:t>
-      </w:r>
-    </w:p>
-    <w:p>
-      <w:pPr>
-        <w:ind w:firstLine="720"/>
-        <w:rPr>
-          <w:rFonts w:cs="Times New Roman"/>
-          <w:sz w:val="28"/>
-          <w:szCs w:val="28"/>
-        </w:rPr>
-      </w:pPr>
-      <w:r>
-        <w:rPr>
-          <w:rFonts w:cs="Times New Roman"/>
-          <w:sz w:val="28"/>
-          <w:szCs w:val="28"/>
-        </w:rPr>
-        <w:t>Complexity creates ambiguity, those who discern more of the ambiguity see how it can create blindspots and obfuscating assumptions. “Legacy Society” doesn’t exist, it’s just society. Yet, the concept remains. Distinction, predictability, knowledge, intelligence systems, are things you have been already and have always been engaged in. Simply as other people populated the planet before you and left you something to get started with. Their intelligence, their cause and its effect</w:t>
-      </w:r>
-      <w:r>
-        <w:rPr>
-          <w:rFonts w:cs="Times New Roman"/>
-          <w:sz w:val="28"/>
-          <w:szCs w:val="28"/>
-        </w:rPr>
-        <w:t xml:space="preserve"> has already influenced you.</w:t>
-      </w:r>
-    </w:p>
-    <w:p>
-      <w:pPr>
-        <w:ind w:firstLine="720"/>
-        <w:rPr>
-          <w:rFonts w:cs="Times New Roman"/>
-          <w:sz w:val="28"/>
-          <w:szCs w:val="28"/>
-        </w:rPr>
-      </w:pPr>
-      <w:r>
-        <w:rPr>
-          <w:rFonts w:cs="Times New Roman"/>
-          <w:sz w:val="28"/>
-          <w:szCs w:val="28"/>
-        </w:rPr>
-        <w:t>People can cause change, and attempt to cause specific changes, and we can call this innovation. If you know the environment, you should see how innovations intertwine into the extant complexity of our world and the nature of our kind.</w:t>
-      </w:r>
-    </w:p>
-    <w:p>
-      <w:pPr>
-        <w:rPr>
-          <w:rFonts w:cs="Times New Roman"/>
-          <w:sz w:val="28"/>
-          <w:szCs w:val="28"/>
-        </w:rPr>
-      </w:pPr>
-    </w:p>
-    <w:p>
-      <w:pPr>
-        <w:jc w:val="center"/>
-        <w:rPr>
-          <w:rFonts w:cs="Times New Roman"/>
-          <w:sz w:val="28"/>
-          <w:szCs w:val="28"/>
-          <w:u w:val="single"/>
-        </w:rPr>
-      </w:pPr>
-      <w:r>
-        <w:rPr>
-          <w:rFonts w:cs="Times New Roman"/>
-          <w:sz w:val="28"/>
-          <w:szCs w:val="28"/>
-          <w:u w:val="single"/>
-        </w:rPr>
-        <w:t>Informed and Aligned Analysis</w:t>
-      </w:r>
-    </w:p>
-    <w:p>
-      <w:pPr>
-        <w:jc w:val="center"/>
-        <w:rPr>
-          <w:rFonts w:cs="Times New Roman"/>
-          <w:sz w:val="28"/>
-          <w:szCs w:val="28"/>
-        </w:rPr>
-      </w:pPr>
-      <w:r>
-        <w:rPr>
-          <w:rFonts w:cs="Times New Roman"/>
-          <w:sz w:val="28"/>
-          <w:szCs w:val="28"/>
-        </w:rPr>
-        <w:lastRenderedPageBreak/>
-        <w:t>- Characterizing ethics in civilization, the traits needed for moral advancements in a tech-evolved world -</w:t>
-      </w:r>
-    </w:p>
-    <w:p>
-      <w:pPr>
-        <w:rPr>
-          <w:rFonts w:cs="Times New Roman"/>
-          <w:sz w:val="28"/>
-          <w:szCs w:val="28"/>
-        </w:rPr>
-      </w:pPr>
-    </w:p>
-    <w:p>
-      <w:pPr>
-        <w:rPr>
-          <w:rFonts w:cs="Times New Roman"/>
-          <w:sz w:val="28"/>
-          <w:szCs w:val="28"/>
-        </w:rPr>
-      </w:pPr>
-      <w:r>
-        <w:rPr>
-          <w:rFonts w:cs="Times New Roman"/>
-          <w:sz w:val="28"/>
-          <w:szCs w:val="28"/>
-        </w:rPr>
-        <w:t>Innovations and development, ethics of technology and environment. What do we owe our understanding to, specifically? Stability. Anything we have, anything we like of what is available to us, comes to us from stability. What gives stability? Whatever gives stability is something we would base our morality on. Perhaps stability itself is the crux of one kind of inevitable dependence; communal interdependence. We depend on communities, we are communities, communal treatment impacts us, we impact communal treatment. It is reciprocity, it is an affect that we can coordinate with.</w:t>
+        <w:t>like of what is available to us, comes to us from stability. What gives stability? Whatever gives stability is something we would base our morality on. Perhaps stability itself is the crux of one kind of inevitable dependence; communal interdependence. We depend on communities, we are communities, communal treatment impacts us, we impact communal treatment. It is reciprocity, it is an affect that we can coordinate with.</w:t>
       </w:r>
     </w:p>
     <w:p>
@@ -2486,14 +2461,17 @@
     </w:p>
     <w:p>
       <w:r>
+        <w:t>The Checker. My first</w:t>
+      </w:r>
+      <w:r>
+        <w:t xml:space="preserve"> Sci-Fi</w:t>
+      </w:r>
+      <w:r>
+        <w:t xml:space="preserve"> novel. The Checker is a work of science fiction that takes place at the end of our century. Beginning in the year 2099, we meet the protagonist. A solitary middle aged man with conviction of purpose, stubborn dedication to his career, and an empty world at his fingertips. He is employed by a governing body composed of a functional cybernetic super intelligence. He is a social worker. While the world is seemingly emptied of humanity, as the climate is problematic, he roams the streets in environmental protective equipment, alone, with </w:t>
+      </w:r>
+      <w:r>
         <w:lastRenderedPageBreak/>
-        <w:t>The Checker. My first</w:t>
-      </w:r>
-      <w:r>
-        <w:t xml:space="preserve"> Sci-Fi</w:t>
-      </w:r>
-      <w:r>
-        <w:t xml:space="preserve"> novel. The Checker is a work of science fiction that takes place at the end of our century. Beginning in the year 2099, we meet the protagonist. A solitary middle aged man with conviction of purpose, stubborn dedication to his career, and an empty world at his fingertips. He is employed by a governing body composed of a functional cybernetic super intelligence. He is a social worker. While the world is seemingly emptied of humanity, as the climate is problematic, he roams the streets in environmental protective equipment, alone, with his technology and his drugs. It’s his job to check on the people that remain, and those people are known as ‘sleepers.’</w:t>
+        <w:t>his technology and his drugs. It’s his job to check on the people that remain, and those people are known as ‘sleepers.’</w:t>
       </w:r>
     </w:p>
     <w:p>
@@ -2535,23 +2513,23 @@
         <w:t>, our man’s employer</w:t>
       </w:r>
       <w:r>
-        <w:t xml:space="preserve">. They keep the distinction over who truly holds power murky, choosing strategies of deception and </w:t>
+        <w:t>. They keep the distinction over who truly holds power murky, choosing strategies of deception and stealth to seek the perseverence of their prestige. These tech-synthes have turned themselves into the governing gridlock of the globe, and they use Angel_Net (the functional cybernetic super intelligence) as a regulatory system for enacting their will and monitoring for affect.</w:t>
+      </w:r>
+    </w:p>
+    <w:p>
+      <w:r>
+        <w:tab/>
+        <w:t>The novel depi</w:t>
+      </w:r>
+      <w:r>
+        <w:t>c</w:t>
+      </w:r>
+      <w:r>
+        <w:t xml:space="preserve">ts many examples of speculative and actual technology as well as emergent science, explored by individuals and groups outside of institutional and ethical </w:t>
       </w:r>
       <w:r>
         <w:lastRenderedPageBreak/>
-        <w:t>stealth to seek the perseverence of their prestige. These tech-synthes have turned themselves into the governing gridlock of the globe, and they use Angel_Net (the functional cybernetic super intelligence) as a regulatory system for enacting their will and monitoring for affect.</w:t>
-      </w:r>
-    </w:p>
-    <w:p>
-      <w:r>
-        <w:tab/>
-        <w:t>The novel depi</w:t>
-      </w:r>
-      <w:r>
-        <w:t>c</w:t>
-      </w:r>
-      <w:r>
-        <w:t xml:space="preserve">ts many examples of speculative and actual technology as well as emergent science, explored by individuals and groups outside of institutional and ethical constraints. The idea is to present a world that contains multiple overlapping technologies, and to show how the human experience is contorted according to the application of such tech and science, structured as an adventure through a world of social inequality, civilizational deprecation, and environmental malaise. </w:t>
+        <w:t xml:space="preserve">constraints. The idea is to present a world that contains multiple overlapping technologies, and to show how the human experience is contorted according to the application of such tech and science, structured as an adventure through a world of social inequality, civilizational deprecation, and environmental malaise. </w:t>
       </w:r>
     </w:p>
     <w:p>
@@ -2720,27 +2698,35 @@
           <w:sz w:val="22"/>
           <w:szCs w:val="22"/>
         </w:rPr>
+        <w:tab/>
+        <w:t xml:space="preserve">The Checker moved down the street, squatting towers of burnt beige slumped on either side, he tred towards his destination. Only two checks today, but he wanted to get them over with soon, so he could go back to doing what he likes best. He already smoked that day, but trouble was always more likely if he went out to do his job with too much of the drug in his system.  </w:t>
+      </w:r>
+    </w:p>
+    <w:p>
+      <w:pPr>
+        <w:rPr>
+          <w:rFonts w:eastAsia="FangSong" w:cs="Tahoma" w:hint="eastAsia"/>
+          <w:sz w:val="22"/>
+          <w:szCs w:val="22"/>
+        </w:rPr>
+      </w:pPr>
+      <w:r>
+        <w:rPr>
+          <w:rFonts w:eastAsia="FangSong" w:cs="Tahoma"/>
+          <w:sz w:val="22"/>
+          <w:szCs w:val="22"/>
+        </w:rPr>
+        <w:tab/>
+        <w:t xml:space="preserve">Water. A resource zone, hidden in an alcove across the street, in an old neighborhood of plastic domes covering ancient homes. He hated ancient homes. They always had stuff in them that would cling </w:t>
+      </w:r>
+      <w:r>
+        <w:rPr>
+          <w:rFonts w:eastAsia="FangSong" w:cs="Tahoma"/>
+          <w:sz w:val="22"/>
+          <w:szCs w:val="22"/>
+        </w:rPr>
         <w:lastRenderedPageBreak/>
-        <w:tab/>
-        <w:t xml:space="preserve">The Checker moved down the street, squatting towers of burnt beige slumped on either side, he tred towards his destination. Only two checks today, but he wanted to get them over with soon, so he could go back to doing what he likes best. He already smoked that day, but trouble was always more likely if he went out to do his job with too much of the drug in his system.  </w:t>
-      </w:r>
-    </w:p>
-    <w:p>
-      <w:pPr>
-        <w:rPr>
-          <w:rFonts w:eastAsia="FangSong" w:cs="Tahoma" w:hint="eastAsia"/>
-          <w:sz w:val="22"/>
-          <w:szCs w:val="22"/>
-        </w:rPr>
-      </w:pPr>
-      <w:r>
-        <w:rPr>
-          <w:rFonts w:eastAsia="FangSong" w:cs="Tahoma"/>
-          <w:sz w:val="22"/>
-          <w:szCs w:val="22"/>
-        </w:rPr>
-        <w:tab/>
-        <w:t xml:space="preserve">Water. A resource zone, hidden in an alcove across the street, in an old neighborhood of plastic domes covering ancient homes. He hated ancient homes. They always had stuff in them that would cling to his suit. Dollars, towels, dresses, curtains, rugs, bedsheets, neckties, they always ended up jammed into the joints of his </w:t>
+        <w:t xml:space="preserve">to his suit. Dollars, towels, dresses, curtains, rugs, bedsheets, neckties, they always ended up jammed into the joints of his </w:t>
       </w:r>
       <w:r>
         <w:rPr>
@@ -2897,57 +2883,57 @@
           <w:sz w:val="22"/>
           <w:szCs w:val="22"/>
         </w:rPr>
+        <w:tab/>
+        <w:t>These days, though, it was different. People gave in, uninterested in facing the difficulties of existence, they were blighted by weakness. This is where the Checker’s memory got hazy. Some had said the a</w:t>
+      </w:r>
+      <w:r>
+        <w:rPr>
+          <w:rFonts w:eastAsia="FangSong" w:cs="Tahoma"/>
+          <w:sz w:val="22"/>
+          <w:szCs w:val="22"/>
+        </w:rPr>
+        <w:t>rtificial intelligence</w:t>
+      </w:r>
+      <w:r>
+        <w:rPr>
+          <w:rFonts w:eastAsia="FangSong" w:cs="Tahoma"/>
+          <w:sz w:val="22"/>
+          <w:szCs w:val="22"/>
+        </w:rPr>
+        <w:t xml:space="preserve"> was facilitating the wishes of humanity only, and that it was a sector of humanity that wished to sway everyone else into addiction. Others said that the </w:t>
+      </w:r>
+      <w:r>
+        <w:rPr>
+          <w:rFonts w:eastAsia="FangSong" w:cs="Tahoma"/>
+          <w:sz w:val="22"/>
+          <w:szCs w:val="22"/>
+        </w:rPr>
+        <w:t>AI</w:t>
+      </w:r>
+      <w:r>
+        <w:rPr>
+          <w:rFonts w:eastAsia="FangSong" w:cs="Tahoma"/>
+          <w:sz w:val="22"/>
+          <w:szCs w:val="22"/>
+        </w:rPr>
+        <w:t xml:space="preserve"> should not be able to do that, even if following instructions from other humans. Some demanded a more autonomous system, a more distant and more powerful government that would give stronger protections against the wrong doers. </w:t>
+      </w:r>
+    </w:p>
+    <w:p>
+      <w:pPr>
+        <w:rPr>
+          <w:rFonts w:eastAsia="FangSong" w:cs="Tahoma" w:hint="eastAsia"/>
+          <w:sz w:val="22"/>
+          <w:szCs w:val="22"/>
+        </w:rPr>
+      </w:pPr>
+      <w:r>
+        <w:rPr>
+          <w:rFonts w:eastAsia="FangSong" w:cs="Tahoma"/>
+          <w:sz w:val="22"/>
+          <w:szCs w:val="22"/>
+        </w:rPr>
         <w:lastRenderedPageBreak/>
-        <w:tab/>
-        <w:t>These days, though, it was different. People gave in, uninterested in facing the difficulties of existence, they were blighted by weakness. This is where the Checker’s memory got hazy. Some had said the a</w:t>
-      </w:r>
-      <w:r>
-        <w:rPr>
-          <w:rFonts w:eastAsia="FangSong" w:cs="Tahoma"/>
-          <w:sz w:val="22"/>
-          <w:szCs w:val="22"/>
-        </w:rPr>
-        <w:t>rtificial intelligence</w:t>
-      </w:r>
-      <w:r>
-        <w:rPr>
-          <w:rFonts w:eastAsia="FangSong" w:cs="Tahoma"/>
-          <w:sz w:val="22"/>
-          <w:szCs w:val="22"/>
-        </w:rPr>
-        <w:t xml:space="preserve"> was facilitating the wishes of humanity only, and that it was a sector of humanity that wished to sway everyone else into addiction. Others said that the </w:t>
-      </w:r>
-      <w:r>
-        <w:rPr>
-          <w:rFonts w:eastAsia="FangSong" w:cs="Tahoma"/>
-          <w:sz w:val="22"/>
-          <w:szCs w:val="22"/>
-        </w:rPr>
-        <w:t>AI</w:t>
-      </w:r>
-      <w:r>
-        <w:rPr>
-          <w:rFonts w:eastAsia="FangSong" w:cs="Tahoma"/>
-          <w:sz w:val="22"/>
-          <w:szCs w:val="22"/>
-        </w:rPr>
-        <w:t xml:space="preserve"> should not be able to do that, even if following instructions from other humans. Some demanded a more autonomous system, a more distant and more powerful government that would give stronger protections against the wrong doers. </w:t>
-      </w:r>
-    </w:p>
-    <w:p>
-      <w:pPr>
-        <w:rPr>
-          <w:rFonts w:eastAsia="FangSong" w:cs="Tahoma" w:hint="eastAsia"/>
-          <w:sz w:val="22"/>
-          <w:szCs w:val="22"/>
-        </w:rPr>
-      </w:pPr>
-      <w:r>
-        <w:rPr>
-          <w:rFonts w:eastAsia="FangSong" w:cs="Tahoma"/>
-          <w:sz w:val="22"/>
-          <w:szCs w:val="22"/>
-        </w:rPr>
         <w:tab/>
         <w:t>But that wasn’t clear to the Checker either, because some had said it was just humanity doing what it always does, just under a new paradigm, arguing that such behavior was inevitable. He shrugged, snorted out some dust into the vacuum plug in his helmet, and sipped his decontaminated and mineral fortified water, from a tube, also inside his helmet. A few more houses along and he’d be at the apartment. The warning symbol flicked off, but by then he’d forgotten it was on, even when it glared at him from inside his visor.</w:t>
       </w:r>
@@ -3177,7 +3163,25 @@
           <w:sz w:val="22"/>
           <w:szCs w:val="22"/>
         </w:rPr>
-        <w:t xml:space="preserve"> isn’t the same. Randy had known his father until the age of seven and his mother until the </w:t>
+        <w:t xml:space="preserve"> isn’t the same. Randy had known his father until the age of seven and his mother until the age of twelve, then spent the next nine years becoming an ever more frequent user of virtual reality, and after an application for greater allowance, granted by Angel_Net, Randy had been given his bio-assist bay, for medical purposes, and consented to his intubation, his set up prepared for maximal longevity and optimized for his enjoyment. </w:t>
+      </w:r>
+    </w:p>
+    <w:p>
+      <w:pPr>
+        <w:rPr>
+          <w:rFonts w:eastAsia="FangSong" w:cs="Tahoma" w:hint="eastAsia"/>
+          <w:sz w:val="22"/>
+          <w:szCs w:val="22"/>
+        </w:rPr>
+      </w:pPr>
+      <w:r>
+        <w:rPr>
+          <w:rFonts w:eastAsia="FangSong" w:cs="Tahoma"/>
+          <w:sz w:val="22"/>
+          <w:szCs w:val="22"/>
+        </w:rPr>
+        <w:tab/>
+        <w:t xml:space="preserve">Having authorization under Angel_Net, the Checker was permitted a privation interference stipulation, allowing him to spectate on the digital ongoings of any client’s virtual scape. Randy, playing in a world of his own making. Overriding Randy’s tech-link, the Checker did a routine inspection of </w:t>
       </w:r>
       <w:r>
         <w:rPr>
@@ -3186,25 +3190,7 @@
           <w:szCs w:val="22"/>
         </w:rPr>
         <w:lastRenderedPageBreak/>
-        <w:t xml:space="preserve">age of twelve, then spent the next nine years becoming an ever more frequent user of virtual reality, and after an application for greater allowance, granted by Angel_Net, Randy had been given his bio-assist bay, for medical purposes, and consented to his intubation, his set up prepared for maximal longevity and optimized for his enjoyment. </w:t>
-      </w:r>
-    </w:p>
-    <w:p>
-      <w:pPr>
-        <w:rPr>
-          <w:rFonts w:eastAsia="FangSong" w:cs="Tahoma" w:hint="eastAsia"/>
-          <w:sz w:val="22"/>
-          <w:szCs w:val="22"/>
-        </w:rPr>
-      </w:pPr>
-      <w:r>
-        <w:rPr>
-          <w:rFonts w:eastAsia="FangSong" w:cs="Tahoma"/>
-          <w:sz w:val="22"/>
-          <w:szCs w:val="22"/>
-        </w:rPr>
-        <w:tab/>
-        <w:t>Having authorization under Angel_Net, the Checker was permitted a privation interference stipulation, allowing him to spectate on the digital ongoings of any client’s virtual scape. Randy, playing in a world of his own making. Overriding Randy’s tech-link, the Checker did a routine inspection of Randy’s invented cyber world. Randy was in a high stakes poker match, cameras dazzling like stars, bursting light over green felt, firing at him in the otherwise morose and grandiose den in which he sinned. The Checker had seen it all and was glad that Randy was as tame as he was. It got worse, frequently. He wished he didn’t have to see the things</w:t>
+        <w:t>Randy’s invented cyber world. Randy was in a high stakes poker match, cameras dazzling like stars, bursting light over green felt, firing at him in the otherwise morose and grandiose den in which he sinned. The Checker had seen it all and was glad that Randy was as tame as he was. It got worse, frequently. He wished he didn’t have to see the things</w:t>
       </w:r>
       <w:r>
         <w:rPr>
@@ -3393,26 +3379,26 @@
           <w:sz w:val="22"/>
           <w:szCs w:val="22"/>
         </w:rPr>
+        <w:tab/>
+        <w:t>Relieved, he was hopeful that he’d go another day without coming across a live one. A category seven of the disruption status: a citizen unplugged. They were usually disoriented, confused as to where they were, bereft as they had been ripped away from their virtual worlds, which were full of easy pleasure and never ending success, all simulated in a setting of their preference, complete with anything bio-assist can do to enhance human wellness, as outlined in the basic preference contracts. People can write their own preference contracts as to what they experience in their virtual worlds, and give instructions to their bio-assist units to cooperate with the virtual world tech to stimulate the body, corresponding to the simulations.</w:t>
+      </w:r>
+    </w:p>
+    <w:p>
+      <w:pPr>
+        <w:rPr>
+          <w:rFonts w:eastAsia="FangSong" w:cs="Tahoma" w:hint="eastAsia"/>
+          <w:sz w:val="22"/>
+          <w:szCs w:val="22"/>
+        </w:rPr>
+      </w:pPr>
+      <w:r>
+        <w:rPr>
+          <w:rFonts w:eastAsia="FangSong" w:cs="Tahoma"/>
+          <w:sz w:val="22"/>
+          <w:szCs w:val="22"/>
+        </w:rPr>
         <w:lastRenderedPageBreak/>
         <w:tab/>
-        <w:t>Relieved, he was hopeful that he’d go another day without coming across a live one. A category seven of the disruption status: a citizen unplugged. They were usually disoriented, confused as to where they were, bereft as they had been ripped away from their virtual worlds, which were full of easy pleasure and never ending success, all simulated in a setting of their preference, complete with anything bio-assist can do to enhance human wellness, as outlined in the basic preference contracts. People can write their own preference contracts as to what they experience in their virtual worlds, and give instructions to their bio-assist units to cooperate with the virtual world tech to stimulate the body, corresponding to the simulations.</w:t>
-      </w:r>
-    </w:p>
-    <w:p>
-      <w:pPr>
-        <w:rPr>
-          <w:rFonts w:eastAsia="FangSong" w:cs="Tahoma" w:hint="eastAsia"/>
-          <w:sz w:val="22"/>
-          <w:szCs w:val="22"/>
-        </w:rPr>
-      </w:pPr>
-      <w:r>
-        <w:rPr>
-          <w:rFonts w:eastAsia="FangSong" w:cs="Tahoma"/>
-          <w:sz w:val="22"/>
-          <w:szCs w:val="22"/>
-        </w:rPr>
-        <w:tab/>
         <w:t>This is how the Checker had come across the worst of his client checks. A person, dazed and faint and unused to resisting actual gravity, wobbling from neglected balance, weakened from lying in the bays of their bio-assist units, struggling with reorienting themselves to the mundane world. It was common for them to have entirely forgotten the real world, and they therefore will mistake it for a farce, under the false assumption that their digital world, a much more pleasant experience, is the truer.</w:t>
       </w:r>
     </w:p>
@@ -3572,7 +3558,6 @@
           <w:sz w:val="22"/>
           <w:szCs w:val="22"/>
         </w:rPr>
-        <w:lastRenderedPageBreak/>
         <w:tab/>
       </w:r>
       <w:r>
@@ -3660,6 +3645,7 @@
           <w:sz w:val="22"/>
           <w:szCs w:val="22"/>
         </w:rPr>
+        <w:lastRenderedPageBreak/>
         <w:tab/>
         <w:t xml:space="preserve">The Checker drove down the causeway, entering the liminal remains of a once bustling city, and, having selected his destination, he let his wheel drive itself to his chosen location. </w:t>
       </w:r>
@@ -3873,7 +3859,6 @@
           <w:sz w:val="22"/>
           <w:szCs w:val="22"/>
         </w:rPr>
-        <w:lastRenderedPageBreak/>
         <w:tab/>
       </w:r>
       <w:r>
@@ -4000,7 +3985,16 @@
           <w:sz w:val="22"/>
           <w:szCs w:val="22"/>
         </w:rPr>
-        <w:t xml:space="preserve"> with Jolt and other AIs. He aged. He considered cloning himself, but this wasn’t a world for children. If the Overseers deemed it necessary, he’d submit his genes to the global fertility stock, but, as it stood all people on bio-assist had agreed to the donation of genetic material to the global stock, and the Overseers had yet to decide on forming another generation of humanity. The stock was kept safe, the life giving technology ready to be used at any time. </w:t>
+        <w:t xml:space="preserve"> with Jolt and other AIs. He aged. He considered cloning himself, but this wasn’t a world for children. If the Overseers </w:t>
+      </w:r>
+      <w:r>
+        <w:rPr>
+          <w:rFonts w:eastAsia="FangSong" w:cs="Tahoma"/>
+          <w:sz w:val="22"/>
+          <w:szCs w:val="22"/>
+        </w:rPr>
+        <w:lastRenderedPageBreak/>
+        <w:t xml:space="preserve">deemed it necessary, he’d submit his genes to the global fertility stock, but, as it stood all people on bio-assist had agreed to the donation of genetic material to the global stock, and the Overseers had yet to decide on forming another generation of humanity. The stock was kept safe, the life giving technology ready to be used at any time. </w:t>
       </w:r>
     </w:p>
     <w:p>
@@ -4206,59 +4200,67 @@
           <w:sz w:val="22"/>
           <w:szCs w:val="22"/>
         </w:rPr>
+        <w:tab/>
+        <w:t xml:space="preserve">He had to admit, despite her intubation, she was still a lovely young woman. The wheel drove itself to a stop outside her building, parking itself neatly by the curb. Slightly nervous, still under the influence of his respite, he relented into lackadaisy as he keyed into her front door. This one worked, </w:t>
+      </w:r>
+      <w:r>
+        <w:rPr>
+          <w:rFonts w:eastAsia="FangSong" w:cs="Tahoma"/>
+          <w:sz w:val="22"/>
+          <w:szCs w:val="22"/>
+        </w:rPr>
+        <w:t>his</w:t>
+      </w:r>
+      <w:r>
+        <w:rPr>
+          <w:rFonts w:eastAsia="FangSong" w:cs="Tahoma"/>
+          <w:sz w:val="22"/>
+          <w:szCs w:val="22"/>
+        </w:rPr>
+        <w:t xml:space="preserve"> </w:t>
+      </w:r>
+      <w:r>
+        <w:rPr>
+          <w:rFonts w:eastAsia="FangSong" w:cs="Tahoma"/>
+          <w:sz w:val="22"/>
+          <w:szCs w:val="22"/>
+        </w:rPr>
+        <w:t>utility</w:t>
+      </w:r>
+      <w:r>
+        <w:rPr>
+          <w:rFonts w:eastAsia="FangSong" w:cs="Tahoma"/>
+          <w:sz w:val="22"/>
+          <w:szCs w:val="22"/>
+        </w:rPr>
+        <w:t xml:space="preserve"> bar wasn’t needed and the dust covered glass door happily opened itself for him. </w:t>
+      </w:r>
+    </w:p>
+    <w:p>
+      <w:pPr>
+        <w:rPr>
+          <w:rFonts w:eastAsia="FangSong" w:cs="Tahoma" w:hint="eastAsia"/>
+          <w:sz w:val="22"/>
+          <w:szCs w:val="22"/>
+        </w:rPr>
+      </w:pPr>
+      <w:r>
+        <w:rPr>
+          <w:rFonts w:eastAsia="FangSong" w:cs="Tahoma"/>
+          <w:sz w:val="22"/>
+          <w:szCs w:val="22"/>
+        </w:rPr>
+        <w:tab/>
+        <w:t xml:space="preserve">Schematics of the building translucently uplinked themselves onto his visor. Wandering his way up to B’melia, the Checker theorized about the Overseers. He considered their arrogance as an inadvertent result of their bio-tech synthesis, as they developed powers beyond human limits, yet with their own semblance of human faults. Egoistic, narcissistic, power-mad and vain in their attempts at </w:t>
+      </w:r>
+      <w:r>
+        <w:rPr>
+          <w:rFonts w:eastAsia="FangSong" w:cs="Tahoma"/>
+          <w:sz w:val="22"/>
+          <w:szCs w:val="22"/>
+        </w:rPr>
         <w:lastRenderedPageBreak/>
-        <w:tab/>
-        <w:t xml:space="preserve">He had to admit, despite her intubation, she was still a lovely young woman. The wheel drove itself to a stop outside her building, parking itself neatly by the curb. Slightly nervous, still under the influence of his respite, he relented into lackadaisy as he keyed into her front door. This one worked, </w:t>
-      </w:r>
-      <w:r>
-        <w:rPr>
-          <w:rFonts w:eastAsia="FangSong" w:cs="Tahoma"/>
-          <w:sz w:val="22"/>
-          <w:szCs w:val="22"/>
-        </w:rPr>
-        <w:t>his</w:t>
-      </w:r>
-      <w:r>
-        <w:rPr>
-          <w:rFonts w:eastAsia="FangSong" w:cs="Tahoma"/>
-          <w:sz w:val="22"/>
-          <w:szCs w:val="22"/>
-        </w:rPr>
-        <w:t xml:space="preserve"> </w:t>
-      </w:r>
-      <w:r>
-        <w:rPr>
-          <w:rFonts w:eastAsia="FangSong" w:cs="Tahoma"/>
-          <w:sz w:val="22"/>
-          <w:szCs w:val="22"/>
-        </w:rPr>
-        <w:t>utility</w:t>
-      </w:r>
-      <w:r>
-        <w:rPr>
-          <w:rFonts w:eastAsia="FangSong" w:cs="Tahoma"/>
-          <w:sz w:val="22"/>
-          <w:szCs w:val="22"/>
-        </w:rPr>
-        <w:t xml:space="preserve"> bar wasn’t needed and the dust covered glass door happily opened itself for him. </w:t>
-      </w:r>
-    </w:p>
-    <w:p>
-      <w:pPr>
-        <w:rPr>
-          <w:rFonts w:eastAsia="FangSong" w:cs="Tahoma" w:hint="eastAsia"/>
-          <w:sz w:val="22"/>
-          <w:szCs w:val="22"/>
-        </w:rPr>
-      </w:pPr>
-      <w:r>
-        <w:rPr>
-          <w:rFonts w:eastAsia="FangSong" w:cs="Tahoma"/>
-          <w:sz w:val="22"/>
-          <w:szCs w:val="22"/>
-        </w:rPr>
-        <w:tab/>
-        <w:t xml:space="preserve">Schematics of the building translucently uplinked themselves onto his visor. Wandering his way up to B’melia, the Checker theorized about the Overseers. He considered their arrogance as an inadvertent result of their bio-tech synthesis, as they developed powers beyond human limits, yet with their own semblance of human faults. Egoistic, narcissistic, power-mad and vain in their attempts at enhanced humility. </w:t>
+        <w:t xml:space="preserve">enhanced humility. </w:t>
       </w:r>
       <w:r>
         <w:rPr>
@@ -4626,7 +4628,6 @@
           <w:sz w:val="22"/>
           <w:szCs w:val="22"/>
         </w:rPr>
-        <w:lastRenderedPageBreak/>
         <w:tab/>
       </w:r>
       <w:r>
@@ -4672,6 +4673,7 @@
           <w:sz w:val="22"/>
           <w:szCs w:val="22"/>
         </w:rPr>
+        <w:lastRenderedPageBreak/>
         <w:tab/>
         <w:t>He repeated the leaping for a second flight of stairs and ran down to the first door. “I’m kicking it in.”</w:t>
       </w:r>
@@ -5029,7 +5031,6 @@
           <w:sz w:val="22"/>
           <w:szCs w:val="22"/>
         </w:rPr>
-        <w:lastRenderedPageBreak/>
         <w:tab/>
       </w:r>
       <w:r>
@@ -5178,6 +5179,7 @@
           <w:sz w:val="22"/>
           <w:szCs w:val="22"/>
         </w:rPr>
+        <w:lastRenderedPageBreak/>
         <w:tab/>
       </w:r>
       <w:r>
@@ -5441,7 +5443,6 @@
           <w:sz w:val="22"/>
           <w:szCs w:val="22"/>
         </w:rPr>
-        <w:lastRenderedPageBreak/>
         <w:tab/>
         <w:t>He reached a hand to his back, pulling his utility bar from the magni-pak and exited the room. Adrenaline pulsed in him as he scanned the hallway. The Checker didn’t see anything unusual. He sprinted to one end of the hall, glanced in both directions, doubled back to the other end, saw nothing there either. Suspicion rising, he took the next flight of stairs to B’melia’s level.</w:t>
       </w:r>
@@ -5517,7 +5518,16 @@
           <w:sz w:val="22"/>
           <w:szCs w:val="22"/>
         </w:rPr>
-        <w:t xml:space="preserve">The Checker paused outside B’melia’s door, raising a fist to knock on it, then stopped. No need to knock, the sleepers all agreed to him checking them in their bio-assist contracts, but when it came to B’melia, he felt she deserved the respect. Sighing, he grabbed the door handle and tried to twist it open. The door stayed shut. Panicked, too much wrong had already happened today, he loaded the tension in his leg and kicked the door open. </w:t>
+        <w:t xml:space="preserve">The Checker paused outside B’melia’s door, raising a fist to knock on it, then stopped. No need to knock, the sleepers all agreed to him checking them in their bio-assist contracts, but when it came to B’melia, he felt she deserved the respect. Sighing, he grabbed the door handle and tried to twist it open. </w:t>
+      </w:r>
+      <w:r>
+        <w:rPr>
+          <w:rFonts w:eastAsia="FangSong" w:cs="Tahoma"/>
+          <w:sz w:val="22"/>
+          <w:szCs w:val="22"/>
+        </w:rPr>
+        <w:lastRenderedPageBreak/>
+        <w:t xml:space="preserve">The door stayed shut. Panicked, too much wrong had already happened today, he loaded the tension in his leg and kicked the door open. </w:t>
       </w:r>
     </w:p>
     <w:p>
@@ -5667,7 +5677,6 @@
           <w:sz w:val="22"/>
           <w:szCs w:val="22"/>
         </w:rPr>
-        <w:lastRenderedPageBreak/>
         <w:tab/>
         <w:t xml:space="preserve">“What do you mean, Jolt?” </w:t>
       </w:r>
@@ -5805,6 +5814,7 @@
           <w:sz w:val="22"/>
           <w:szCs w:val="22"/>
         </w:rPr>
+        <w:lastRenderedPageBreak/>
         <w:tab/>
       </w:r>
       <w:r>
@@ -6100,16 +6110,7 @@
           <w:sz w:val="22"/>
           <w:szCs w:val="22"/>
         </w:rPr>
-        <w:t xml:space="preserve">s. He selected hers, then added another six, randomly choosing them based on his unenthused impressions. It wouldn’t really matter. </w:t>
-      </w:r>
-      <w:r>
-        <w:rPr>
-          <w:rFonts w:eastAsia="FangSong" w:cs="Tahoma"/>
-          <w:sz w:val="22"/>
-          <w:szCs w:val="22"/>
-        </w:rPr>
-        <w:lastRenderedPageBreak/>
-        <w:t>Worst thing the sleepers would do, realistically, is suck the energy from the building, but it was free electricity, provided by Angel_Net’s ubiquitous solar arrays. There was the chance that he’d get a live one, that one of these seven would experience the specific series of malfunctions that led to their return to the beige, banal, plastic coated world of 2099, and a part of him wished they’d do so, but he couldn’t think like that.</w:t>
+        <w:t>s. He selected hers, then added another six, randomly choosing them based on his unenthused impressions. It wouldn’t really matter. Worst thing the sleepers would do, realistically, is suck the energy from the building, but it was free electricity, provided by Angel_Net’s ubiquitous solar arrays. There was the chance that he’d get a live one, that one of these seven would experience the specific series of malfunctions that led to their return to the beige, banal, plastic coated world of 2099, and a part of him wished they’d do so, but he couldn’t think like that.</w:t>
       </w:r>
     </w:p>
     <w:p>
@@ -6209,6 +6210,7 @@
           <w:sz w:val="22"/>
           <w:szCs w:val="22"/>
         </w:rPr>
+        <w:lastRenderedPageBreak/>
         <w:tab/>
         <w:t xml:space="preserve">“Yay.” </w:t>
       </w:r>
@@ -6642,7 +6644,14 @@
         <w:rPr>
           <w:rFonts w:eastAsia="FangSong"/>
         </w:rPr>
-        <w:t>n investigator of myth and a theorist of technological divergence, my writing is concerned with the variance in outcomes of the human experience as our civilization continues its advancement. Holding a bachelor’s degree from The Evergreen State College, I combine my academic training with my background in music. Once trained as a cellist, I infuse my writing with musical methods, and base my craft as expression beyond formula. A local of the Puget Sound area, I enjoy my time exploring PNW markets, wandering the woods, and reflecting at the shores of the Pacific.</w:t>
+        <w:t xml:space="preserve">n investigator of myth and a theorist of technological divergence, my writing is concerned with the variance in outcomes of the human experience as our civilization continues its advancement. Holding a bachelor’s degree from The Evergreen State College, I combine my academic training with my background in music. Once trained as a cellist, I infuse my writing with musical methods, and base my craft as expression </w:t>
+      </w:r>
+      <w:r>
+        <w:rPr>
+          <w:rFonts w:eastAsia="FangSong"/>
+        </w:rPr>
+        <w:lastRenderedPageBreak/>
+        <w:t>beyond formula. A local of the Puget Sound area, I enjoy my time exploring PNW markets, wandering the woods, and reflecting at the shores of the Pacific.</w:t>
       </w:r>
     </w:p>
     <w:p>

</xml_diff>